<commit_message>
docs: update resume and portfolio documents for Maher Fayad
</commit_message>
<xml_diff>
--- a/Maher-Fayad-Senior-Product-Designer.docx
+++ b/Maher-Fayad-Senior-Product-Designer.docx
@@ -110,8 +110,19 @@
             <w:szCs w:val="17"/>
             <w:u w:val="single"/>
           </w:rPr>
-          <w:t>linkedin.com/in/maherfayad</w:t>
+          <w:t>linkedin.com/in/</w:t>
         </w:r>
+        <w:proofErr w:type="spellStart"/>
+        <w:r>
+          <w:rPr>
+            <w:color w:val="156082" w:themeColor="accent1"/>
+            <w:sz w:val="17"/>
+            <w:szCs w:val="17"/>
+            <w:u w:val="single"/>
+          </w:rPr>
+          <w:t>maherfayad</w:t>
+        </w:r>
+        <w:proofErr w:type="spellEnd"/>
       </w:hyperlink>
     </w:p>
     <w:p>
@@ -139,7 +150,21 @@
         <w:rPr>
           <w:color w:val="222222"/>
         </w:rPr>
-        <w:t>Senior Product Designer specializing in bilingual (Arabic/English) experiences for the GCC market. Drove a 47% increase in online account openings and 81% growth in e-business transactions across Saudi Arabia’s largest financial institutions. Now designing end-to-end journeys for Almosafer. Deep expertise in design systems, RTL localization, and analytics-informed funnel optimization.</w:t>
+        <w:t xml:space="preserve">Senior Product Designer specializing in bilingual (Arabic/English) experiences for the GCC market. Drove a 47% increase in online account openings and 81% growth in e-business transactions across Saudi Arabia’s largest financial institutions. Now designing end-to-end journeys for </w:t>
+      </w:r>
+      <w:proofErr w:type="spellStart"/>
+      <w:r>
+        <w:rPr>
+          <w:color w:val="222222"/>
+        </w:rPr>
+        <w:t>Almosafer</w:t>
+      </w:r>
+      <w:proofErr w:type="spellEnd"/>
+      <w:r>
+        <w:rPr>
+          <w:color w:val="222222"/>
+        </w:rPr>
+        <w:t>. Deep expertise in design systems, RTL localization, and analytics-informed funnel optimization.</w:t>
       </w:r>
     </w:p>
     <w:p>
@@ -167,6 +192,7 @@
         <w:spacing w:before="120"/>
         <w:ind w:left="8910" w:hanging="8910"/>
       </w:pPr>
+      <w:proofErr w:type="spellStart"/>
       <w:r>
         <w:rPr>
           <w:b/>
@@ -177,6 +203,7 @@
         </w:rPr>
         <w:t>Almosafer</w:t>
       </w:r>
+      <w:proofErr w:type="spellEnd"/>
       <w:r>
         <w:rPr>
           <w:color w:val="555555"/>
@@ -239,13 +266,23 @@
         </w:rPr>
         <w:t xml:space="preserve">Design end-to-end Arabic/English booking journeys across flights, hotels, and activities for </w:t>
       </w:r>
-      <w:r>
-        <w:rPr>
-          <w:b/>
-          <w:bCs/>
-          <w:color w:val="222222"/>
-        </w:rPr>
-        <w:t>Almosafer, Saudi Arabia’s largest OTA (61% of OTA air bookings) and the Middle East’s largest travel business.</w:t>
+      <w:proofErr w:type="spellStart"/>
+      <w:r>
+        <w:rPr>
+          <w:b/>
+          <w:bCs/>
+          <w:color w:val="222222"/>
+        </w:rPr>
+        <w:t>Almosafer</w:t>
+      </w:r>
+      <w:proofErr w:type="spellEnd"/>
+      <w:r>
+        <w:rPr>
+          <w:b/>
+          <w:bCs/>
+          <w:color w:val="222222"/>
+        </w:rPr>
+        <w:t>, Saudi Arabia’s largest OTA (61% of OTA air bookings) and the Middle East’s largest travel business.</w:t>
       </w:r>
     </w:p>
     <w:p>
@@ -472,7 +509,35 @@
         <w:rPr>
           <w:color w:val="222222"/>
         </w:rPr>
-        <w:t>Designed across Al Rajhi group entities including Al Rajhi Capital, Emkan Finance, and neoleap.</w:t>
+        <w:t xml:space="preserve">Designed across Al Rajhi group entities including Al Rajhi Capital, </w:t>
+      </w:r>
+      <w:proofErr w:type="spellStart"/>
+      <w:r>
+        <w:rPr>
+          <w:color w:val="222222"/>
+        </w:rPr>
+        <w:t>Emkan</w:t>
+      </w:r>
+      <w:proofErr w:type="spellEnd"/>
+      <w:r>
+        <w:rPr>
+          <w:color w:val="222222"/>
+        </w:rPr>
+        <w:t xml:space="preserve"> Finance, and </w:t>
+      </w:r>
+      <w:proofErr w:type="spellStart"/>
+      <w:r>
+        <w:rPr>
+          <w:color w:val="222222"/>
+        </w:rPr>
+        <w:t>neoleap</w:t>
+      </w:r>
+      <w:proofErr w:type="spellEnd"/>
+      <w:r>
+        <w:rPr>
+          <w:color w:val="222222"/>
+        </w:rPr>
+        <w:t>.</w:t>
       </w:r>
     </w:p>
     <w:p>
@@ -615,7 +680,25 @@
           <w:iCs/>
           <w:color w:val="156082" w:themeColor="accent1"/>
         </w:rPr>
-        <w:t>Clients: MIT Olin Foundation, Konica Minolta, SuperSight, Six Clovers, and others</w:t>
+        <w:t xml:space="preserve">Clients: MIT Olin Foundation, Konica Minolta, </w:t>
+      </w:r>
+      <w:proofErr w:type="spellStart"/>
+      <w:r>
+        <w:rPr>
+          <w:i/>
+          <w:iCs/>
+          <w:color w:val="156082" w:themeColor="accent1"/>
+        </w:rPr>
+        <w:t>SuperSight</w:t>
+      </w:r>
+      <w:proofErr w:type="spellEnd"/>
+      <w:r>
+        <w:rPr>
+          <w:i/>
+          <w:iCs/>
+          <w:color w:val="156082" w:themeColor="accent1"/>
+        </w:rPr>
+        <w:t>, Six Clovers, and others</w:t>
       </w:r>
       <w:r>
         <w:rPr>
@@ -642,7 +725,21 @@
         <w:rPr>
           <w:color w:val="222222"/>
         </w:rPr>
-        <w:t xml:space="preserve">Shipped Sanarte (mobile soundscape app, </w:t>
+        <w:t xml:space="preserve">Shipped </w:t>
+      </w:r>
+      <w:proofErr w:type="spellStart"/>
+      <w:r>
+        <w:rPr>
+          <w:color w:val="222222"/>
+        </w:rPr>
+        <w:t>Sanarte</w:t>
+      </w:r>
+      <w:proofErr w:type="spellEnd"/>
+      <w:r>
+        <w:rPr>
+          <w:color w:val="222222"/>
+        </w:rPr>
+        <w:t xml:space="preserve"> (mobile soundscape app, </w:t>
       </w:r>
       <w:r>
         <w:rPr>
@@ -670,7 +767,21 @@
         <w:rPr>
           <w:color w:val="222222"/>
         </w:rPr>
-        <w:t xml:space="preserve"> via Octalysis gamification).</w:t>
+        <w:t xml:space="preserve"> via </w:t>
+      </w:r>
+      <w:proofErr w:type="spellStart"/>
+      <w:r>
+        <w:rPr>
+          <w:color w:val="222222"/>
+        </w:rPr>
+        <w:t>Octalysis</w:t>
+      </w:r>
+      <w:proofErr w:type="spellEnd"/>
+      <w:r>
+        <w:rPr>
+          <w:color w:val="222222"/>
+        </w:rPr>
+        <w:t xml:space="preserve"> gamification).</w:t>
       </w:r>
     </w:p>
     <w:p>
@@ -694,7 +805,15 @@
           <w:bCs/>
           <w:color w:val="222222"/>
         </w:rPr>
-        <w:t>15+ clients</w:t>
+        <w:t>50</w:t>
+      </w:r>
+      <w:r>
+        <w:rPr>
+          <w:b/>
+          <w:bCs/>
+          <w:color w:val="222222"/>
+        </w:rPr>
+        <w:t>+ clients</w:t>
       </w:r>
       <w:r>
         <w:rPr>
@@ -716,7 +835,21 @@
         <w:rPr>
           <w:color w:val="222222"/>
         </w:rPr>
-        <w:t>Built Campus51 (LMS for curriculum and student engagement), Deployo (AI model-deployment dashboard for DevOps), and Six Clovers (decentralized payment portal with developer docs).</w:t>
+        <w:t xml:space="preserve">Built Campus51 (LMS for curriculum and student engagement), </w:t>
+      </w:r>
+      <w:proofErr w:type="spellStart"/>
+      <w:r>
+        <w:rPr>
+          <w:color w:val="222222"/>
+        </w:rPr>
+        <w:t>Deployo</w:t>
+      </w:r>
+      <w:proofErr w:type="spellEnd"/>
+      <w:r>
+        <w:rPr>
+          <w:color w:val="222222"/>
+        </w:rPr>
+        <w:t xml:space="preserve"> (AI model-deployment dashboard for DevOps), and Six Clovers (decentralized payment portal with developer docs).</w:t>
       </w:r>
     </w:p>
     <w:p>
@@ -738,7 +871,35 @@
         <w:rPr>
           <w:color w:val="222222"/>
         </w:rPr>
-        <w:t>UI/UX Designer, GameIT (2022, part-time)  ·  UX Design Intern, Algoriza (2022)</w:t>
+        <w:t xml:space="preserve">UI/UX Designer, </w:t>
+      </w:r>
+      <w:proofErr w:type="spellStart"/>
+      <w:r>
+        <w:rPr>
+          <w:color w:val="222222"/>
+        </w:rPr>
+        <w:t>GameIT</w:t>
+      </w:r>
+      <w:proofErr w:type="spellEnd"/>
+      <w:r>
+        <w:rPr>
+          <w:color w:val="222222"/>
+        </w:rPr>
+        <w:t xml:space="preserve"> (2022, part-time)  ·  UX Design Intern, </w:t>
+      </w:r>
+      <w:proofErr w:type="spellStart"/>
+      <w:r>
+        <w:rPr>
+          <w:color w:val="222222"/>
+        </w:rPr>
+        <w:t>Algoriza</w:t>
+      </w:r>
+      <w:proofErr w:type="spellEnd"/>
+      <w:r>
+        <w:rPr>
+          <w:color w:val="222222"/>
+        </w:rPr>
+        <w:t xml:space="preserve"> (2022)</w:t>
       </w:r>
     </w:p>
     <w:p>
@@ -766,6 +927,7 @@
     <w:p>
       <w:pPr>
         <w:spacing w:after="24"/>
+        <w:ind w:left="630" w:hanging="630"/>
       </w:pPr>
       <w:r>
         <w:rPr>
@@ -817,7 +979,21 @@
         <w:rPr>
           <w:color w:val="222222"/>
         </w:rPr>
-        <w:t>Figma · FigJam · Sketch · Adobe XD · Axure · Miro · Design Thinking · Prototyping · Agile/Scrum</w:t>
+        <w:t xml:space="preserve">Figma · </w:t>
+      </w:r>
+      <w:proofErr w:type="spellStart"/>
+      <w:r>
+        <w:rPr>
+          <w:color w:val="222222"/>
+        </w:rPr>
+        <w:t>FigJam</w:t>
+      </w:r>
+      <w:proofErr w:type="spellEnd"/>
+      <w:r>
+        <w:rPr>
+          <w:color w:val="222222"/>
+        </w:rPr>
+        <w:t xml:space="preserve"> · Sketch · Adobe XD · Axure · Miro · Design Thinking · Prototyping · Agile/Scrum</w:t>
       </w:r>
     </w:p>
     <w:p>
@@ -886,6 +1062,7 @@
     <w:p>
       <w:pPr>
         <w:spacing w:after="24"/>
+        <w:ind w:left="1350" w:hanging="1350"/>
         <w:rPr>
           <w:color w:val="222222"/>
         </w:rPr>

</xml_diff>